<commit_message>
Deployed cf79c0e0 with MkDocs version: 1.6.1
</commit_message>
<xml_diff>
--- a/download/accounting_point_bidding_zone.docx
+++ b/download/accounting_point_bidding_zone.docx
@@ -716,14 +716,92 @@
         <w:t xml:space="preserve">System Operator</w:t>
       </w:r>
     </w:p>
-    <w:p>
-      <w:pPr>
-        <w:pStyle w:val="FirstParagraph"/>
-      </w:pPr>
-      <w:r>
-        <w:t xml:space="preserve">No policies.</w:t>
-      </w:r>
-    </w:p>
+    <w:tbl>
+      <w:tblPr>
+        <w:tblStyle w:val="Table"/>
+        <w:tblW w:type="pct" w:w="5000"/>
+        <w:tblLayout w:type="fixed"/>
+        <w:tblLook w:firstRow="1" w:lastRow="0" w:firstColumn="0" w:lastColumn="0" w:noHBand="0" w:noVBand="0" w:val="0020"/>
+      </w:tblPr>
+      <w:tblGrid>
+        <w:gridCol w:w="1391"/>
+        <w:gridCol w:w="5672"/>
+        <w:gridCol w:w="856"/>
+      </w:tblGrid>
+      <w:tr>
+        <w:trPr>
+          <w:tblHeader w:val="on"/>
+        </w:trPr>
+        <w:tc>
+          <w:tcPr/>
+          <w:p>
+            <w:pPr>
+              <w:pStyle w:val="Compact"/>
+            </w:pPr>
+            <w:r>
+              <w:t xml:space="preserve">Policy key</w:t>
+            </w:r>
+          </w:p>
+        </w:tc>
+        <w:tc>
+          <w:tcPr/>
+          <w:p>
+            <w:pPr>
+              <w:pStyle w:val="Compact"/>
+            </w:pPr>
+            <w:r>
+              <w:t xml:space="preserve">Policy</w:t>
+            </w:r>
+          </w:p>
+        </w:tc>
+        <w:tc>
+          <w:tcPr/>
+          <w:p>
+            <w:pPr>
+              <w:pStyle w:val="Compact"/>
+            </w:pPr>
+            <w:r>
+              <w:t xml:space="preserve">Status</w:t>
+            </w:r>
+          </w:p>
+        </w:tc>
+      </w:tr>
+      <w:tr>
+        <w:tc>
+          <w:tcPr/>
+          <w:p>
+            <w:pPr>
+              <w:pStyle w:val="Compact"/>
+            </w:pPr>
+            <w:r>
+              <w:t xml:space="preserve">APBZ-SO001</w:t>
+            </w:r>
+          </w:p>
+        </w:tc>
+        <w:tc>
+          <w:tcPr/>
+          <w:p>
+            <w:pPr>
+              <w:pStyle w:val="Compact"/>
+            </w:pPr>
+            <w:r>
+              <w:t xml:space="preserve">Read APBZ when they are system operator on the AP.</w:t>
+            </w:r>
+          </w:p>
+        </w:tc>
+        <w:tc>
+          <w:tcPr/>
+          <w:p>
+            <w:pPr>
+              <w:pStyle w:val="Compact"/>
+            </w:pPr>
+            <w:r>
+              <w:t xml:space="preserve">DONE</w:t>
+            </w:r>
+          </w:p>
+        </w:tc>
+      </w:tr>
+    </w:tbl>
     <w:bookmarkEnd w:id="36"/>
     <w:bookmarkStart w:id="37" w:name="service-provider"/>
     <w:p>
@@ -734,14 +812,92 @@
         <w:t xml:space="preserve">Service Provider</w:t>
       </w:r>
     </w:p>
-    <w:p>
-      <w:pPr>
-        <w:pStyle w:val="FirstParagraph"/>
-      </w:pPr>
-      <w:r>
-        <w:t xml:space="preserve">No policies.</w:t>
-      </w:r>
-    </w:p>
+    <w:tbl>
+      <w:tblPr>
+        <w:tblStyle w:val="Table"/>
+        <w:tblW w:type="pct" w:w="5000"/>
+        <w:tblLayout w:type="fixed"/>
+        <w:tblLook w:firstRow="1" w:lastRow="0" w:firstColumn="0" w:lastColumn="0" w:noHBand="0" w:noVBand="0" w:val="0020"/>
+      </w:tblPr>
+      <w:tblGrid>
+        <w:gridCol w:w="1197"/>
+        <w:gridCol w:w="5986"/>
+        <w:gridCol w:w="736"/>
+      </w:tblGrid>
+      <w:tr>
+        <w:trPr>
+          <w:tblHeader w:val="on"/>
+        </w:trPr>
+        <w:tc>
+          <w:tcPr/>
+          <w:p>
+            <w:pPr>
+              <w:pStyle w:val="Compact"/>
+            </w:pPr>
+            <w:r>
+              <w:t xml:space="preserve">Policy key</w:t>
+            </w:r>
+          </w:p>
+        </w:tc>
+        <w:tc>
+          <w:tcPr/>
+          <w:p>
+            <w:pPr>
+              <w:pStyle w:val="Compact"/>
+            </w:pPr>
+            <w:r>
+              <w:t xml:space="preserve">Policy</w:t>
+            </w:r>
+          </w:p>
+        </w:tc>
+        <w:tc>
+          <w:tcPr/>
+          <w:p>
+            <w:pPr>
+              <w:pStyle w:val="Compact"/>
+            </w:pPr>
+            <w:r>
+              <w:t xml:space="preserve">Status</w:t>
+            </w:r>
+          </w:p>
+        </w:tc>
+      </w:tr>
+      <w:tr>
+        <w:tc>
+          <w:tcPr/>
+          <w:p>
+            <w:pPr>
+              <w:pStyle w:val="Compact"/>
+            </w:pPr>
+            <w:r>
+              <w:t xml:space="preserve">APBZ-SP001</w:t>
+            </w:r>
+          </w:p>
+        </w:tc>
+        <w:tc>
+          <w:tcPr/>
+          <w:p>
+            <w:pPr>
+              <w:pStyle w:val="Compact"/>
+            </w:pPr>
+            <w:r>
+              <w:t xml:space="preserve">Read APBZ on periods where they are related to a CU on the AP.</w:t>
+            </w:r>
+          </w:p>
+        </w:tc>
+        <w:tc>
+          <w:tcPr/>
+          <w:p>
+            <w:pPr>
+              <w:pStyle w:val="Compact"/>
+            </w:pPr>
+            <w:r>
+              <w:t xml:space="preserve">DONE</w:t>
+            </w:r>
+          </w:p>
+        </w:tc>
+      </w:tr>
+    </w:tbl>
     <w:bookmarkEnd w:id="37"/>
     <w:bookmarkStart w:id="38" w:name="third-party"/>
     <w:p>

</xml_diff>